<commit_message>
fix: update letter number in PDF and DOCX
</commit_message>
<xml_diff>
--- a/docs/SURAT_PERMOHONAN_KERJASAMA_LHKPN.docx
+++ b/docs/SURAT_PERMOHONAN_KERJASAMA_LHKPN.docx
@@ -6,7 +6,7 @@
       <w:pPr>
         <w:jc w:val="center"/>
         <w:outlineLvl w:val="1"/>
-        <w:divId w:val="2016615621"/>
+        <w:divId w:val="1937589089"/>
         <w:rPr>
           <w:rFonts w:eastAsia="Times New Roman"/>
           <w:b/>
@@ -36,7 +36,7 @@
       <w:pPr>
         <w:spacing w:before="75"/>
         <w:jc w:val="center"/>
-        <w:divId w:val="2016615621"/>
+        <w:divId w:val="1937589089"/>
         <w:rPr>
           <w:color w:val="000000"/>
           <w:sz w:val="22"/>
@@ -51,7 +51,7 @@
           <w:szCs w:val="22"/>
           <w:lang w:val="id-ID"/>
         </w:rPr>
-        <w:t>Nomor: [NOMOR SURAT]</w:t>
+        <w:t>Nomor: 001/LDS/IX/2026</w:t>
       </w:r>
     </w:p>
     <w:tbl>
@@ -71,7 +71,7 @@
       </w:tblGrid>
       <w:tr>
         <w:trPr>
-          <w:divId w:val="159128971"/>
+          <w:divId w:val="110518152"/>
         </w:trPr>
         <w:tc>
           <w:tcPr>
@@ -130,7 +130,7 @@
       </w:tr>
       <w:tr>
         <w:trPr>
-          <w:divId w:val="159128971"/>
+          <w:divId w:val="110518152"/>
         </w:trPr>
         <w:tc>
           <w:tcPr>
@@ -190,7 +190,7 @@
     </w:tbl>
     <w:p>
       <w:pPr>
-        <w:divId w:val="1868789408"/>
+        <w:divId w:val="322469149"/>
         <w:rPr>
           <w:color w:val="000000"/>
           <w:lang w:val="id-ID"/>
@@ -206,7 +206,7 @@
     </w:p>
     <w:p>
       <w:pPr>
-        <w:divId w:val="1868789408"/>
+        <w:divId w:val="322469149"/>
         <w:rPr>
           <w:color w:val="000000"/>
           <w:lang w:val="id-ID"/>
@@ -223,7 +223,7 @@
     </w:p>
     <w:p>
       <w:pPr>
-        <w:divId w:val="1868789408"/>
+        <w:divId w:val="322469149"/>
         <w:rPr>
           <w:color w:val="000000"/>
           <w:lang w:val="id-ID"/>
@@ -240,7 +240,7 @@
     </w:p>
     <w:p>
       <w:pPr>
-        <w:divId w:val="1868789408"/>
+        <w:divId w:val="322469149"/>
         <w:rPr>
           <w:color w:val="000000"/>
           <w:lang w:val="id-ID"/>
@@ -256,7 +256,7 @@
     </w:p>
     <w:p>
       <w:pPr>
-        <w:divId w:val="1868789408"/>
+        <w:divId w:val="322469149"/>
         <w:rPr>
           <w:color w:val="000000"/>
           <w:lang w:val="id-ID"/>
@@ -272,7 +272,7 @@
     </w:p>
     <w:p>
       <w:pPr>
-        <w:divId w:val="1868789408"/>
+        <w:divId w:val="322469149"/>
         <w:rPr>
           <w:color w:val="000000"/>
           <w:lang w:val="id-ID"/>
@@ -1197,7 +1197,7 @@
     <w:p>
       <w:pPr>
         <w:spacing w:before="45" w:after="45"/>
-        <w:divId w:val="1549953892"/>
+        <w:divId w:val="820002016"/>
         <w:rPr>
           <w:color w:val="000000"/>
           <w:lang w:val="id-ID"/>
@@ -1213,7 +1213,7 @@
     </w:p>
     <w:p>
       <w:pPr>
-        <w:divId w:val="1549953892"/>
+        <w:divId w:val="820002016"/>
         <w:rPr>
           <w:rFonts w:eastAsia="Times New Roman"/>
           <w:color w:val="000000"/>
@@ -1224,7 +1224,7 @@
     <w:p>
       <w:pPr>
         <w:spacing w:before="45" w:after="45"/>
-        <w:divId w:val="1549953892"/>
+        <w:divId w:val="820002016"/>
         <w:rPr>
           <w:color w:val="000000"/>
           <w:lang w:val="id-ID"/>
@@ -1241,7 +1241,7 @@
     <w:p>
       <w:pPr>
         <w:spacing w:after="240"/>
-        <w:divId w:val="1549953892"/>
+        <w:divId w:val="820002016"/>
         <w:rPr>
           <w:rFonts w:eastAsia="Times New Roman"/>
           <w:color w:val="000000"/>
@@ -1260,7 +1260,7 @@
     <w:p>
       <w:pPr>
         <w:spacing w:before="45" w:after="45"/>
-        <w:divId w:val="1549953892"/>
+        <w:divId w:val="820002016"/>
         <w:rPr>
           <w:color w:val="000000"/>
           <w:lang w:val="id-ID"/>
@@ -1287,7 +1287,7 @@
     <w:p>
       <w:pPr>
         <w:spacing w:before="45" w:after="45"/>
-        <w:divId w:val="466046541"/>
+        <w:divId w:val="1779057401"/>
         <w:rPr>
           <w:color w:val="000000"/>
           <w:lang w:val="id-ID"/>
@@ -1309,7 +1309,7 @@
           <w:numId w:val="5"/>
         </w:numPr>
         <w:spacing w:before="100" w:beforeAutospacing="1" w:after="100" w:afterAutospacing="1"/>
-        <w:divId w:val="466046541"/>
+        <w:divId w:val="1779057401"/>
         <w:rPr>
           <w:rFonts w:eastAsia="Times New Roman"/>
           <w:color w:val="000000"/>
@@ -1332,7 +1332,7 @@
           <w:numId w:val="5"/>
         </w:numPr>
         <w:spacing w:before="100" w:beforeAutospacing="1" w:after="100" w:afterAutospacing="1"/>
-        <w:divId w:val="466046541"/>
+        <w:divId w:val="1779057401"/>
         <w:rPr>
           <w:rFonts w:eastAsia="Times New Roman"/>
           <w:color w:val="000000"/>
@@ -1355,7 +1355,7 @@
           <w:numId w:val="5"/>
         </w:numPr>
         <w:spacing w:before="100" w:beforeAutospacing="1" w:after="100" w:afterAutospacing="1"/>
-        <w:divId w:val="466046541"/>
+        <w:divId w:val="1779057401"/>
         <w:rPr>
           <w:rFonts w:eastAsia="Times New Roman"/>
           <w:color w:val="000000"/>
@@ -1378,7 +1378,7 @@
           <w:numId w:val="5"/>
         </w:numPr>
         <w:spacing w:before="100" w:beforeAutospacing="1" w:after="100" w:afterAutospacing="1"/>
-        <w:divId w:val="466046541"/>
+        <w:divId w:val="1779057401"/>
         <w:rPr>
           <w:rFonts w:eastAsia="Times New Roman"/>
           <w:color w:val="000000"/>
@@ -1407,9 +1407,9 @@
 <file path=word/numbering.xml><?xml version="1.0" encoding="utf-8"?>
 <w:numbering xmlns:wpc="http://schemas.microsoft.com/office/word/2010/wordprocessingCanvas" xmlns:cx="http://schemas.microsoft.com/office/drawing/2014/chartex" xmlns:cx1="http://schemas.microsoft.com/office/drawing/2015/9/8/chartex" xmlns:cx2="http://schemas.microsoft.com/office/drawing/2015/10/21/chartex" xmlns:cx3="http://schemas.microsoft.com/office/drawing/2016/5/9/chartex" xmlns:cx4="http://schemas.microsoft.com/office/drawing/2016/5/10/chartex" xmlns:cx5="http://schemas.microsoft.com/office/drawing/2016/5/11/chartex" xmlns:cx6="http://schemas.microsoft.com/office/drawing/2016/5/12/chartex" xmlns:cx7="http://schemas.microsoft.com/office/drawing/2016/5/13/chartex" xmlns:cx8="http://schemas.microsoft.com/office/drawing/2016/5/14/chartex" xmlns:mc="http://schemas.openxmlformats.org/markup-compatibility/2006" xmlns:aink="http://schemas.microsoft.com/office/drawing/2016/ink" xmlns:am3d="http://schemas.microsoft.com/office/drawing/2017/model3d" xmlns:o="urn:schemas-microsoft-com:office:office" xmlns:oel="http://schemas.microsoft.com/office/2019/extlst" xmlns:r="http://schemas.openxmlformats.org/officeDocument/2006/relationships" xmlns:m="http://schemas.openxmlformats.org/officeDocument/2006/math" xmlns:v="urn:schemas-microsoft-com:vml" xmlns:wp14="http://schemas.microsoft.com/office/word/2010/wordprocessingDrawing" xmlns:wp="http://schemas.openxmlformats.org/drawingml/2006/wordprocessingDrawing" xmlns:w10="urn:schemas-microsoft-com:office:word" xmlns:w="http://schemas.openxmlformats.org/wordprocessingml/2006/main" xmlns:w14="http://schemas.microsoft.com/office/word/2010/wordml" xmlns:w15="http://schemas.microsoft.com/office/word/2012/wordml" xmlns:w16cex="http://schemas.microsoft.com/office/word/2018/wordml/cex" xmlns:w16cid="http://schemas.microsoft.com/office/word/2016/wordml/cid" xmlns:w16="http://schemas.microsoft.com/office/word/2018/wordml" xmlns:w16du="http://schemas.microsoft.com/office/word/2023/wordml/word16du" xmlns:w16sdtdh="http://schemas.microsoft.com/office/word/2020/wordml/sdtdatahash" xmlns:w16sdtfl="http://schemas.microsoft.com/office/word/2024/wordml/sdtformatlock" xmlns:w16se="http://schemas.microsoft.com/office/word/2015/wordml/symex" xmlns:wpg="http://schemas.microsoft.com/office/word/2010/wordprocessingGroup" xmlns:wpi="http://schemas.microsoft.com/office/word/2010/wordprocessingInk" xmlns:wne="http://schemas.microsoft.com/office/word/2006/wordml" xmlns:wps="http://schemas.microsoft.com/office/word/2010/wordprocessingShape" mc:Ignorable="w14 w15 w16se w16cid w16 w16cex w16sdtdh w16sdtfl w16du wp14">
   <w:abstractNum w:abstractNumId="0" w15:restartNumberingAfterBreak="0">
-    <w:nsid w:val="02494714"/>
+    <w:nsid w:val="03201D5A"/>
     <w:multiLevelType w:val="multilevel"/>
-    <w:tmpl w:val="3AC062BC"/>
+    <w:tmpl w:val="6A64EBCC"/>
     <w:lvl w:ilvl="0">
       <w:start w:val="1"/>
       <w:numFmt w:val="decimal"/>
@@ -1520,122 +1520,9 @@
     </w:lvl>
   </w:abstractNum>
   <w:abstractNum w:abstractNumId="1" w15:restartNumberingAfterBreak="0">
-    <w:nsid w:val="02A65B88"/>
+    <w:nsid w:val="2522435F"/>
     <w:multiLevelType w:val="multilevel"/>
-    <w:tmpl w:val="88BADF80"/>
-    <w:lvl w:ilvl="0">
-      <w:start w:val="1"/>
-      <w:numFmt w:val="decimal"/>
-      <w:lvlText w:val="%1."/>
-      <w:lvlJc w:val="left"/>
-      <w:pPr>
-        <w:tabs>
-          <w:tab w:val="num" w:pos="720"/>
-        </w:tabs>
-        <w:ind w:left="720" w:hanging="360"/>
-      </w:pPr>
-    </w:lvl>
-    <w:lvl w:ilvl="1" w:tentative="1">
-      <w:start w:val="1"/>
-      <w:numFmt w:val="decimal"/>
-      <w:lvlText w:val="%2."/>
-      <w:lvlJc w:val="left"/>
-      <w:pPr>
-        <w:tabs>
-          <w:tab w:val="num" w:pos="1440"/>
-        </w:tabs>
-        <w:ind w:left="1440" w:hanging="360"/>
-      </w:pPr>
-    </w:lvl>
-    <w:lvl w:ilvl="2" w:tentative="1">
-      <w:start w:val="1"/>
-      <w:numFmt w:val="decimal"/>
-      <w:lvlText w:val="%3."/>
-      <w:lvlJc w:val="left"/>
-      <w:pPr>
-        <w:tabs>
-          <w:tab w:val="num" w:pos="2160"/>
-        </w:tabs>
-        <w:ind w:left="2160" w:hanging="360"/>
-      </w:pPr>
-    </w:lvl>
-    <w:lvl w:ilvl="3" w:tentative="1">
-      <w:start w:val="1"/>
-      <w:numFmt w:val="decimal"/>
-      <w:lvlText w:val="%4."/>
-      <w:lvlJc w:val="left"/>
-      <w:pPr>
-        <w:tabs>
-          <w:tab w:val="num" w:pos="2880"/>
-        </w:tabs>
-        <w:ind w:left="2880" w:hanging="360"/>
-      </w:pPr>
-    </w:lvl>
-    <w:lvl w:ilvl="4" w:tentative="1">
-      <w:start w:val="1"/>
-      <w:numFmt w:val="decimal"/>
-      <w:lvlText w:val="%5."/>
-      <w:lvlJc w:val="left"/>
-      <w:pPr>
-        <w:tabs>
-          <w:tab w:val="num" w:pos="3600"/>
-        </w:tabs>
-        <w:ind w:left="3600" w:hanging="360"/>
-      </w:pPr>
-    </w:lvl>
-    <w:lvl w:ilvl="5" w:tentative="1">
-      <w:start w:val="1"/>
-      <w:numFmt w:val="decimal"/>
-      <w:lvlText w:val="%6."/>
-      <w:lvlJc w:val="left"/>
-      <w:pPr>
-        <w:tabs>
-          <w:tab w:val="num" w:pos="4320"/>
-        </w:tabs>
-        <w:ind w:left="4320" w:hanging="360"/>
-      </w:pPr>
-    </w:lvl>
-    <w:lvl w:ilvl="6" w:tentative="1">
-      <w:start w:val="1"/>
-      <w:numFmt w:val="decimal"/>
-      <w:lvlText w:val="%7."/>
-      <w:lvlJc w:val="left"/>
-      <w:pPr>
-        <w:tabs>
-          <w:tab w:val="num" w:pos="5040"/>
-        </w:tabs>
-        <w:ind w:left="5040" w:hanging="360"/>
-      </w:pPr>
-    </w:lvl>
-    <w:lvl w:ilvl="7" w:tentative="1">
-      <w:start w:val="1"/>
-      <w:numFmt w:val="decimal"/>
-      <w:lvlText w:val="%8."/>
-      <w:lvlJc w:val="left"/>
-      <w:pPr>
-        <w:tabs>
-          <w:tab w:val="num" w:pos="5760"/>
-        </w:tabs>
-        <w:ind w:left="5760" w:hanging="360"/>
-      </w:pPr>
-    </w:lvl>
-    <w:lvl w:ilvl="8" w:tentative="1">
-      <w:start w:val="1"/>
-      <w:numFmt w:val="decimal"/>
-      <w:lvlText w:val="%9."/>
-      <w:lvlJc w:val="left"/>
-      <w:pPr>
-        <w:tabs>
-          <w:tab w:val="num" w:pos="6480"/>
-        </w:tabs>
-        <w:ind w:left="6480" w:hanging="360"/>
-      </w:pPr>
-    </w:lvl>
-  </w:abstractNum>
-  <w:abstractNum w:abstractNumId="2" w15:restartNumberingAfterBreak="0">
-    <w:nsid w:val="0CDF73C5"/>
-    <w:multiLevelType w:val="multilevel"/>
-    <w:tmpl w:val="1A802518"/>
+    <w:tmpl w:val="8DECF8E2"/>
     <w:lvl w:ilvl="0">
       <w:start w:val="1"/>
       <w:numFmt w:val="bullet"/>
@@ -1781,10 +1668,10 @@
       </w:rPr>
     </w:lvl>
   </w:abstractNum>
-  <w:abstractNum w:abstractNumId="3" w15:restartNumberingAfterBreak="0">
-    <w:nsid w:val="32634AB7"/>
+  <w:abstractNum w:abstractNumId="2" w15:restartNumberingAfterBreak="0">
+    <w:nsid w:val="54576019"/>
     <w:multiLevelType w:val="multilevel"/>
-    <w:tmpl w:val="0D5A9F68"/>
+    <w:tmpl w:val="F77E3B26"/>
     <w:lvl w:ilvl="0">
       <w:start w:val="1"/>
       <w:numFmt w:val="decimal"/>
@@ -1894,10 +1781,10 @@
       </w:pPr>
     </w:lvl>
   </w:abstractNum>
-  <w:abstractNum w:abstractNumId="4" w15:restartNumberingAfterBreak="0">
-    <w:nsid w:val="7B023D26"/>
+  <w:abstractNum w:abstractNumId="3" w15:restartNumberingAfterBreak="0">
+    <w:nsid w:val="70ED0FBD"/>
     <w:multiLevelType w:val="multilevel"/>
-    <w:tmpl w:val="10E8ECE0"/>
+    <w:tmpl w:val="8DBCC7CA"/>
     <w:lvl w:ilvl="0">
       <w:start w:val="1"/>
       <w:numFmt w:val="bullet"/>
@@ -2043,20 +1930,133 @@
       </w:rPr>
     </w:lvl>
   </w:abstractNum>
-  <w:num w:numId="1" w16cid:durableId="1081412796">
+  <w:abstractNum w:abstractNumId="4" w15:restartNumberingAfterBreak="0">
+    <w:nsid w:val="7B59473F"/>
+    <w:multiLevelType w:val="multilevel"/>
+    <w:tmpl w:val="132011A4"/>
+    <w:lvl w:ilvl="0">
+      <w:start w:val="1"/>
+      <w:numFmt w:val="decimal"/>
+      <w:lvlText w:val="%1."/>
+      <w:lvlJc w:val="left"/>
+      <w:pPr>
+        <w:tabs>
+          <w:tab w:val="num" w:pos="720"/>
+        </w:tabs>
+        <w:ind w:left="720" w:hanging="360"/>
+      </w:pPr>
+    </w:lvl>
+    <w:lvl w:ilvl="1" w:tentative="1">
+      <w:start w:val="1"/>
+      <w:numFmt w:val="decimal"/>
+      <w:lvlText w:val="%2."/>
+      <w:lvlJc w:val="left"/>
+      <w:pPr>
+        <w:tabs>
+          <w:tab w:val="num" w:pos="1440"/>
+        </w:tabs>
+        <w:ind w:left="1440" w:hanging="360"/>
+      </w:pPr>
+    </w:lvl>
+    <w:lvl w:ilvl="2" w:tentative="1">
+      <w:start w:val="1"/>
+      <w:numFmt w:val="decimal"/>
+      <w:lvlText w:val="%3."/>
+      <w:lvlJc w:val="left"/>
+      <w:pPr>
+        <w:tabs>
+          <w:tab w:val="num" w:pos="2160"/>
+        </w:tabs>
+        <w:ind w:left="2160" w:hanging="360"/>
+      </w:pPr>
+    </w:lvl>
+    <w:lvl w:ilvl="3" w:tentative="1">
+      <w:start w:val="1"/>
+      <w:numFmt w:val="decimal"/>
+      <w:lvlText w:val="%4."/>
+      <w:lvlJc w:val="left"/>
+      <w:pPr>
+        <w:tabs>
+          <w:tab w:val="num" w:pos="2880"/>
+        </w:tabs>
+        <w:ind w:left="2880" w:hanging="360"/>
+      </w:pPr>
+    </w:lvl>
+    <w:lvl w:ilvl="4" w:tentative="1">
+      <w:start w:val="1"/>
+      <w:numFmt w:val="decimal"/>
+      <w:lvlText w:val="%5."/>
+      <w:lvlJc w:val="left"/>
+      <w:pPr>
+        <w:tabs>
+          <w:tab w:val="num" w:pos="3600"/>
+        </w:tabs>
+        <w:ind w:left="3600" w:hanging="360"/>
+      </w:pPr>
+    </w:lvl>
+    <w:lvl w:ilvl="5" w:tentative="1">
+      <w:start w:val="1"/>
+      <w:numFmt w:val="decimal"/>
+      <w:lvlText w:val="%6."/>
+      <w:lvlJc w:val="left"/>
+      <w:pPr>
+        <w:tabs>
+          <w:tab w:val="num" w:pos="4320"/>
+        </w:tabs>
+        <w:ind w:left="4320" w:hanging="360"/>
+      </w:pPr>
+    </w:lvl>
+    <w:lvl w:ilvl="6" w:tentative="1">
+      <w:start w:val="1"/>
+      <w:numFmt w:val="decimal"/>
+      <w:lvlText w:val="%7."/>
+      <w:lvlJc w:val="left"/>
+      <w:pPr>
+        <w:tabs>
+          <w:tab w:val="num" w:pos="5040"/>
+        </w:tabs>
+        <w:ind w:left="5040" w:hanging="360"/>
+      </w:pPr>
+    </w:lvl>
+    <w:lvl w:ilvl="7" w:tentative="1">
+      <w:start w:val="1"/>
+      <w:numFmt w:val="decimal"/>
+      <w:lvlText w:val="%8."/>
+      <w:lvlJc w:val="left"/>
+      <w:pPr>
+        <w:tabs>
+          <w:tab w:val="num" w:pos="5760"/>
+        </w:tabs>
+        <w:ind w:left="5760" w:hanging="360"/>
+      </w:pPr>
+    </w:lvl>
+    <w:lvl w:ilvl="8" w:tentative="1">
+      <w:start w:val="1"/>
+      <w:numFmt w:val="decimal"/>
+      <w:lvlText w:val="%9."/>
+      <w:lvlJc w:val="left"/>
+      <w:pPr>
+        <w:tabs>
+          <w:tab w:val="num" w:pos="6480"/>
+        </w:tabs>
+        <w:ind w:left="6480" w:hanging="360"/>
+      </w:pPr>
+    </w:lvl>
+  </w:abstractNum>
+  <w:num w:numId="1" w16cid:durableId="645209106">
+    <w:abstractNumId w:val="3"/>
+  </w:num>
+  <w:num w:numId="2" w16cid:durableId="1050765759">
+    <w:abstractNumId w:val="0"/>
+  </w:num>
+  <w:num w:numId="3" w16cid:durableId="1291134706">
+    <w:abstractNumId w:val="1"/>
+  </w:num>
+  <w:num w:numId="4" w16cid:durableId="1436097972">
     <w:abstractNumId w:val="2"/>
   </w:num>
-  <w:num w:numId="2" w16cid:durableId="1794325180">
-    <w:abstractNumId w:val="3"/>
-  </w:num>
-  <w:num w:numId="3" w16cid:durableId="1986546729">
+  <w:num w:numId="5" w16cid:durableId="432212170">
     <w:abstractNumId w:val="4"/>
-  </w:num>
-  <w:num w:numId="4" w16cid:durableId="1964460135">
-    <w:abstractNumId w:val="1"/>
-  </w:num>
-  <w:num w:numId="5" w16cid:durableId="555047335">
-    <w:abstractNumId w:val="0"/>
   </w:num>
 </w:numbering>
 </file>

</xml_diff>